<commit_message>
arreglo de errores ERR-14....
</commit_message>
<xml_diff>
--- a/Fase 2/Evidencias Proyecto/Evidencias de documentación/1.6 Informe TEC/Informe TEC.docx
+++ b/Fase 2/Evidencias Proyecto/Evidencias de documentación/1.6 Informe TEC/Informe TEC.docx
@@ -2290,6 +2290,347 @@
           <w:bCs w:val="1"/>
         </w:rPr>
       </w:pPr>
+      <w:bookmarkStart w:colFirst="0" w:colLast="0" w:name="_9m3x90b8fdyy" w:id="5"/>
+      <w:bookmarkEnd w:id="5"/>
+      <w:r>
+        <w:rPr>
+          <w:b w:val="1"/>
+          <w:bCs w:val="1"/>
+          <w:rtl w:val="0"/>
+        </w:rPr>
+        <w:t xml:space="preserve">Presupuesto de Infraestructura y Herramientas a Utilizar</w:t>
+      </w:r>
+    </w:p>
+    <w:p>
+      <w:pPr>
+        <w:rPr>
+          <w:sz w:val="24"/>
+          <w:szCs w:val="24"/>
+          <w:rtl w:val="0"/>
+        </w:rPr>
+      </w:pPr>
+      <w:r>
+        <w:rPr>
+          <w:sz w:val="24"/>
+          <w:szCs w:val="24"/>
+          <w:rtl w:val="0"/>
+        </w:rPr>
+        <w:t xml:space="preserve">Estos son los costos de infraestructura y herramientas considerados en el proyecto:</w:t>
+      </w:r>
+    </w:p>
+    <w:p>
+      <w:pPr>
+        <w:numPr>
+          <w:ilvl w:val="0"/>
+          <w:numId w:val="2"/>
+        </w:numPr>
+        <w:ind w:left="720" w:hanging="360"/>
+        <w:rPr>
+          <w:sz w:val="24"/>
+          <w:szCs w:val="24"/>
+          <w:rtl w:val="0"/>
+        </w:rPr>
+      </w:pPr>
+      <w:r>
+        <w:rPr>
+          <w:b w:val="1"/>
+          <w:bCs w:val="1"/>
+          <w:sz w:val="24"/>
+          <w:szCs w:val="24"/>
+          <w:rtl w:val="0"/>
+        </w:rPr>
+        <w:t xml:space="preserve">Herramientas de desarrollo </w:t>
+      </w:r>
+      <w:r>
+        <w:rPr>
+          <w:sz w:val="24"/>
+          <w:szCs w:val="24"/>
+          <w:rtl w:val="0"/>
+        </w:rPr>
+        <w:t xml:space="preserve">(Node.js 24.21.0, TypeScript, Turborepo, Docker Desktop, PostgreSQL 15 en contenedor, GitHub): $0 (licencias gratuitas o de uso educativo).</w:t>
+      </w:r>
+    </w:p>
+    <w:p>
+      <w:pPr>
+        <w:numPr>
+          <w:ilvl w:val="0"/>
+          <w:numId w:val="2"/>
+        </w:numPr>
+        <w:ind w:left="720" w:hanging="360"/>
+        <w:rPr>
+          <w:sz w:val="24"/>
+          <w:szCs w:val="24"/>
+          <w:rtl w:val="0"/>
+        </w:rPr>
+      </w:pPr>
+      <w:r>
+        <w:rPr>
+          <w:b w:val="1"/>
+          <w:bCs w:val="1"/>
+          <w:sz w:val="24"/>
+          <w:szCs w:val="24"/>
+          <w:rtl w:val="0"/>
+        </w:rPr>
+        <w:t xml:space="preserve">PayPal REST API en modo sandbox: </w:t>
+      </w:r>
+      <w:r>
+        <w:rPr>
+          <w:sz w:val="24"/>
+          <w:szCs w:val="24"/>
+          <w:rtl w:val="0"/>
+        </w:rPr>
+        <w:t xml:space="preserve">$0 durante las pruebas; en producción cobra una comisión por transacción.</w:t>
+      </w:r>
+    </w:p>
+    <w:p>
+      <w:pPr>
+        <w:numPr>
+          <w:ilvl w:val="0"/>
+          <w:numId w:val="2"/>
+        </w:numPr>
+        <w:ind w:left="720" w:hanging="360"/>
+        <w:rPr>
+          <w:sz w:val="24"/>
+          <w:szCs w:val="24"/>
+          <w:rtl w:val="0"/>
+        </w:rPr>
+      </w:pPr>
+      <w:r>
+        <w:rPr>
+          <w:b w:val="1"/>
+          <w:bCs w:val="1"/>
+          <w:sz w:val="24"/>
+          <w:szCs w:val="24"/>
+          <w:rtl w:val="0"/>
+        </w:rPr>
+        <w:t xml:space="preserve">Firebase Authentication (plan Spark): </w:t>
+      </w:r>
+      <w:r>
+        <w:rPr>
+          <w:sz w:val="24"/>
+          <w:szCs w:val="24"/>
+          <w:rtl w:val="0"/>
+        </w:rPr>
+        <w:t xml:space="preserve">$0 para la verificación de correo y la recuperación de contraseña.</w:t>
+      </w:r>
+    </w:p>
+    <w:p>
+      <w:pPr>
+        <w:numPr>
+          <w:ilvl w:val="0"/>
+          <w:numId w:val="2"/>
+        </w:numPr>
+        <w:ind w:left="720" w:hanging="360"/>
+        <w:rPr>
+          <w:sz w:val="24"/>
+          <w:szCs w:val="24"/>
+          <w:rtl w:val="0"/>
+        </w:rPr>
+      </w:pPr>
+      <w:r>
+        <w:rPr>
+          <w:b w:val="1"/>
+          <w:bCs w:val="1"/>
+          <w:sz w:val="24"/>
+          <w:szCs w:val="24"/>
+          <w:rtl w:val="0"/>
+        </w:rPr>
+        <w:t xml:space="preserve">Google Maps Platform: </w:t>
+      </w:r>
+      <w:r>
+        <w:rPr>
+          <w:sz w:val="24"/>
+          <w:szCs w:val="24"/>
+          <w:rtl w:val="0"/>
+        </w:rPr>
+        <w:t xml:space="preserve">$0 dentro de la cuota gratuita mensual; requiere una cuenta de facturación activa.</w:t>
+      </w:r>
+    </w:p>
+    <w:p>
+      <w:pPr>
+        <w:numPr>
+          <w:ilvl w:val="0"/>
+          <w:numId w:val="2"/>
+        </w:numPr>
+        <w:ind w:left="720" w:hanging="360"/>
+        <w:rPr>
+          <w:sz w:val="24"/>
+          <w:szCs w:val="24"/>
+          <w:rtl w:val="0"/>
+        </w:rPr>
+      </w:pPr>
+      <w:r>
+        <w:rPr>
+          <w:b w:val="1"/>
+          <w:bCs w:val="1"/>
+          <w:sz w:val="24"/>
+          <w:szCs w:val="24"/>
+          <w:rtl w:val="0"/>
+        </w:rPr>
+        <w:t xml:space="preserve">jsReport: </w:t>
+      </w:r>
+      <w:r>
+        <w:rPr>
+          <w:sz w:val="24"/>
+          <w:szCs w:val="24"/>
+          <w:rtl w:val="0"/>
+        </w:rPr>
+        <w:t xml:space="preserve">$0 con la licencia gratuita, que limita la cantidad de plantillas.</w:t>
+      </w:r>
+    </w:p>
+    <w:p>
+      <w:pPr>
+        <w:numPr>
+          <w:ilvl w:val="0"/>
+          <w:numId w:val="2"/>
+        </w:numPr>
+        <w:ind w:left="720" w:hanging="360"/>
+        <w:rPr>
+          <w:sz w:val="24"/>
+          <w:szCs w:val="24"/>
+          <w:rtl w:val="0"/>
+        </w:rPr>
+      </w:pPr>
+      <w:r>
+        <w:rPr>
+          <w:b w:val="1"/>
+          <w:bCs w:val="1"/>
+          <w:sz w:val="24"/>
+          <w:szCs w:val="24"/>
+          <w:rtl w:val="0"/>
+        </w:rPr>
+        <w:t xml:space="preserve">Mindicador: </w:t>
+      </w:r>
+      <w:r>
+        <w:rPr>
+          <w:sz w:val="24"/>
+          <w:szCs w:val="24"/>
+          <w:rtl w:val="0"/>
+        </w:rPr>
+        <w:t xml:space="preserve">$0 (API pública de indicadores económicos).</w:t>
+      </w:r>
+    </w:p>
+    <w:p>
+      <w:pPr>
+        <w:numPr>
+          <w:ilvl w:val="0"/>
+          <w:numId w:val="2"/>
+        </w:numPr>
+        <w:ind w:left="720" w:hanging="360"/>
+        <w:rPr>
+          <w:sz w:val="24"/>
+          <w:szCs w:val="24"/>
+          <w:rtl w:val="0"/>
+        </w:rPr>
+      </w:pPr>
+      <w:r>
+        <w:rPr>
+          <w:b w:val="1"/>
+          <w:bCs w:val="1"/>
+          <w:sz w:val="24"/>
+          <w:szCs w:val="24"/>
+          <w:rtl w:val="0"/>
+        </w:rPr>
+        <w:t xml:space="preserve">Servicio de mensajería para el despacho de alertas: </w:t>
+      </w:r>
+      <w:r>
+        <w:rPr>
+          <w:sz w:val="24"/>
+          <w:szCs w:val="24"/>
+          <w:rtl w:val="0"/>
+        </w:rPr>
+        <w:t xml:space="preserve">costo por mensaje, pendiente de definir junto con el proveedor.</w:t>
+      </w:r>
+    </w:p>
+    <w:p>
+      <w:pPr>
+        <w:numPr>
+          <w:ilvl w:val="0"/>
+          <w:numId w:val="2"/>
+        </w:numPr>
+        <w:ind w:left="720" w:hanging="360"/>
+        <w:rPr>
+          <w:sz w:val="24"/>
+          <w:szCs w:val="24"/>
+          <w:rtl w:val="0"/>
+        </w:rPr>
+      </w:pPr>
+      <w:r>
+        <w:rPr>
+          <w:b w:val="1"/>
+          <w:bCs w:val="1"/>
+          <w:sz w:val="24"/>
+          <w:szCs w:val="24"/>
+          <w:rtl w:val="0"/>
+        </w:rPr>
+        <w:t xml:space="preserve">Hosting del backend y de la base de datos para la Fase 3: </w:t>
+      </w:r>
+      <w:r>
+        <w:rPr>
+          <w:sz w:val="24"/>
+          <w:szCs w:val="24"/>
+          <w:rtl w:val="0"/>
+        </w:rPr>
+        <w:t xml:space="preserve">pendiente de definir.</w:t>
+      </w:r>
+    </w:p>
+    <w:p>
+      <w:pPr>
+        <w:numPr>
+          <w:ilvl w:val="0"/>
+          <w:numId w:val="2"/>
+        </w:numPr>
+        <w:ind w:left="720" w:hanging="360"/>
+        <w:rPr>
+          <w:sz w:val="24"/>
+          <w:szCs w:val="24"/>
+          <w:rtl w:val="0"/>
+        </w:rPr>
+      </w:pPr>
+      <w:r>
+        <w:rPr>
+          <w:b w:val="1"/>
+          <w:bCs w:val="1"/>
+          <w:sz w:val="24"/>
+          <w:szCs w:val="24"/>
+          <w:rtl w:val="0"/>
+        </w:rPr>
+        <w:t xml:space="preserve">Publicación en tiendas, solo si se publica en la Fase 3: </w:t>
+      </w:r>
+      <w:r>
+        <w:rPr>
+          <w:sz w:val="24"/>
+          <w:szCs w:val="24"/>
+          <w:rtl w:val="0"/>
+        </w:rPr>
+        <w:t xml:space="preserve">Google Play, pago único de US$25; Apple Developer Program, US$99 al año.</w:t>
+      </w:r>
+    </w:p>
+    <w:p>
+      <w:pPr>
+        <w:rPr>
+          <w:sz w:val="24"/>
+          <w:szCs w:val="24"/>
+          <w:rtl w:val="0"/>
+        </w:rPr>
+      </w:pPr>
+      <w:r>
+        <w:rPr>
+          <w:sz w:val="24"/>
+          <w:szCs w:val="24"/>
+          <w:rtl w:val="0"/>
+        </w:rPr>
+        <w:t xml:space="preserve">El presupuesto total de $1.496.400 CLP no cambia en esta versión: los costos de infraestructura conocidos son $0 durante el desarrollo, y los pendientes se agregarán cuando el equipo los defina.</w:t>
+      </w:r>
+    </w:p>
+    <w:p>
+      <w:pPr>
+        <w:pStyle w:val="Heading2"/>
+        <w:rPr>
+          <w:b w:val="1"/>
+          <w:bCs w:val="1"/>
+        </w:rPr>
+      </w:pPr>
       <w:bookmarkStart w:colFirst="0" w:colLast="0" w:name="_mrwk07e7s9yk" w:id="4"/>
       <w:bookmarkEnd w:id="4"/>
       <w:r>

</xml_diff>